<commit_message>
feat: modularize codebase, add activity editing modal & dual-axis signature sizing engine
- Modularized HTML, CSS, and JS into css/styles.css, js/data.js, js/app.js, and js/certificates.js
- Added double-click and button triggers for Edit Training Details modal across Activities table, Dashboard, and Attendance modal
- Implemented independent Width (40-320px) and Height (20-140px) sliders with Free Stretch (Fill) vs Proportional (Contain) fit modes for signatures
- Added Men in the Kitchen 2 theme preset, watermark layering (Behind/In Front), and whole-certificate border overlays
- Updated comprehensive system documentation in README.md
</commit_message>
<xml_diff>
--- a/MEMO TO MOVE (Men In The Kitchen) 2026.docx
+++ b/MEMO TO MOVE (Men In The Kitchen) 2026.docx
@@ -3871,7 +3871,7 @@
               </w:rPr>
             </w:pPr>
             <w:r>
-              <w:t>ITLIONG, JOSEPH MARY S.</w:t>
+              <w:t>MALLORCA, HAROLD P.</w:t>
             </w:r>
           </w:p>
         </w:tc>
@@ -3935,7 +3935,7 @@
               </w:rPr>
             </w:pPr>
             <w:r>
-              <w:t>MALLORCA, HAROLD P.</w:t>
+              <w:t>DELA CRUZ, FLORENTINO N. JR.</w:t>
             </w:r>
           </w:p>
         </w:tc>
@@ -3953,7 +3953,7 @@
               </w:rPr>
             </w:pPr>
             <w:r>
-              <w:t>CHRMO</w:t>
+              <w:t>CMO-LIBRARY</w:t>
             </w:r>
           </w:p>
         </w:tc>
@@ -3999,7 +3999,7 @@
               </w:rPr>
             </w:pPr>
             <w:r>
-              <w:t>DELA CRUZ, FLORENTINO N. JR.</w:t>
+              <w:t>SUMCAD, JUDAH F.</w:t>
             </w:r>
           </w:p>
         </w:tc>
@@ -4063,7 +4063,7 @@
               </w:rPr>
             </w:pPr>
             <w:r>
-              <w:t>SUMCAD, JUDAH F.</w:t>
+              <w:t>GANGA, MARIO D. JR.</w:t>
             </w:r>
           </w:p>
         </w:tc>
@@ -4081,7 +4081,7 @@
               </w:rPr>
             </w:pPr>
             <w:r>
-              <w:t>CMO-LIBRARY</w:t>
+              <w:t>CMO-PDAO</w:t>
             </w:r>
           </w:p>
         </w:tc>
@@ -4127,7 +4127,7 @@
               </w:rPr>
             </w:pPr>
             <w:r>
-              <w:t>GANGA, MARIO D. JR.</w:t>
+              <w:t>RAGUDO, REGINO G.</w:t>
             </w:r>
           </w:p>
         </w:tc>
@@ -4145,7 +4145,7 @@
               </w:rPr>
             </w:pPr>
             <w:r>
-              <w:t>CMO-PDAO</w:t>
+              <w:t>CTO</w:t>
             </w:r>
           </w:p>
         </w:tc>
@@ -4191,7 +4191,7 @@
               </w:rPr>
             </w:pPr>
             <w:r>
-              <w:t>RAGUDO, REGINO G.</w:t>
+              <w:t>BULACAN, CRISTOBAL T.</w:t>
             </w:r>
           </w:p>
         </w:tc>
@@ -4209,7 +4209,7 @@
               </w:rPr>
             </w:pPr>
             <w:r>
-              <w:t>CTO</w:t>
+              <w:t>HSO</w:t>
             </w:r>
           </w:p>
         </w:tc>
@@ -4255,7 +4255,7 @@
               </w:rPr>
             </w:pPr>
             <w:r>
-              <w:t>BULACAN, CRISTOBAL T.</w:t>
+              <w:t>MARTIN, JAYSON R.</w:t>
             </w:r>
           </w:p>
         </w:tc>
@@ -4273,7 +4273,7 @@
               </w:rPr>
             </w:pPr>
             <w:r>
-              <w:t>HSO</w:t>
+              <w:t>OCSWDO</w:t>
             </w:r>
           </w:p>
         </w:tc>
@@ -4319,7 +4319,7 @@
               </w:rPr>
             </w:pPr>
             <w:r>
-              <w:t>MARTIN, JAYSON R.</w:t>
+              <w:t>TUPONG, JACQUELINE C.</w:t>
             </w:r>
           </w:p>
         </w:tc>
@@ -4383,7 +4383,7 @@
               </w:rPr>
             </w:pPr>
             <w:r>
-              <w:t>TUPONG, JACQUELINE C.</w:t>
+              <w:t>GUADAÑA, RUPERTO D. JR.</w:t>
             </w:r>
           </w:p>
         </w:tc>
@@ -4401,7 +4401,71 @@
               </w:rPr>
             </w:pPr>
             <w:r>
-              <w:t>OCSWDO</w:t>
+              <w:t>SP</w:t>
+            </w:r>
+          </w:p>
+        </w:tc>
+      </w:tr>
+      <w:tr>
+        <w:trPr>
+          <w:trHeight w:val="56"/>
+        </w:trPr>
+        <w:tc>
+          <w:tcPr>
+            <w:tcW w:w="985" w:type="dxa"/>
+            <w:vAlign w:val="center"/>
+          </w:tcPr>
+          <w:p>
+            <w:pPr>
+              <w:spacing w:after="0" w:line="240" w:lineRule="auto"/>
+              <w:jc w:val="center"/>
+              <w:rPr>
+                <w:rFonts w:ascii="Arial" w:eastAsiaTheme="minorHAnsi" w:hAnsi="Arial" w:cs="Arial"/>
+                <w:sz w:val="24"/>
+                <w:szCs w:val="24"/>
+                <w:lang w:val="en-PH"/>
+              </w:rPr>
+            </w:pPr>
+            <w:r>
+              <w:rPr>
+                <w:rFonts w:ascii="Calibri" w:hAnsi="Calibri" w:cs="Calibri"/>
+              </w:rPr>
+              <w:t>61</w:t>
+            </w:r>
+          </w:p>
+        </w:tc>
+        <w:tc>
+          <w:tcPr>
+            <w:tcW w:w="3870" w:type="dxa"/>
+          </w:tcPr>
+          <w:p>
+            <w:pPr>
+              <w:spacing w:after="0" w:line="240" w:lineRule="auto"/>
+              <w:jc w:val="center"/>
+              <w:rPr>
+                <w:rFonts w:ascii="Calibri" w:hAnsi="Calibri" w:cs="Calibri"/>
+              </w:rPr>
+            </w:pPr>
+            <w:r>
+              <w:t>ONG, DAN RICKY M.</w:t>
+            </w:r>
+          </w:p>
+        </w:tc>
+        <w:tc>
+          <w:tcPr>
+            <w:tcW w:w="4410" w:type="dxa"/>
+            <w:shd w:val="clear" w:color="auto" w:fill="FFFFFF" w:themeFill="background1"/>
+          </w:tcPr>
+          <w:p>
+            <w:pPr>
+              <w:spacing w:after="0" w:line="240" w:lineRule="auto"/>
+              <w:jc w:val="center"/>
+              <w:rPr>
+                <w:rFonts w:ascii="Calibri" w:hAnsi="Calibri" w:cs="Calibri"/>
+              </w:rPr>
+            </w:pPr>
+            <w:r>
+              <w:t>SP</w:t>
             </w:r>
           </w:p>
         </w:tc>
@@ -4430,7 +4494,7 @@
               <w:rPr>
                 <w:rFonts w:ascii="Calibri" w:hAnsi="Calibri" w:cs="Calibri"/>
               </w:rPr>
-              <w:t>61</w:t>
+              <w:t>62</w:t>
             </w:r>
           </w:p>
         </w:tc>
@@ -4447,7 +4511,7 @@
               </w:rPr>
             </w:pPr>
             <w:r>
-              <w:t>GUADAÑA, RUPERTO D. JR.</w:t>
+              <w:t>TANGALIN, PROTACIO P. JR.</w:t>
             </w:r>
           </w:p>
         </w:tc>
@@ -4494,7 +4558,7 @@
               <w:rPr>
                 <w:rFonts w:ascii="Calibri" w:hAnsi="Calibri" w:cs="Calibri"/>
               </w:rPr>
-              <w:t>62</w:t>
+              <w:t>63</w:t>
             </w:r>
           </w:p>
         </w:tc>
@@ -4510,9 +4574,6 @@
                 <w:rFonts w:ascii="Calibri" w:hAnsi="Calibri" w:cs="Calibri"/>
               </w:rPr>
             </w:pPr>
-            <w:r>
-              <w:t>ONG, DAN RICKY M.</w:t>
-            </w:r>
           </w:p>
         </w:tc>
         <w:tc>
@@ -4528,9 +4589,6 @@
                 <w:rFonts w:ascii="Calibri" w:hAnsi="Calibri" w:cs="Calibri"/>
               </w:rPr>
             </w:pPr>
-            <w:r>
-              <w:t>SP</w:t>
-            </w:r>
           </w:p>
         </w:tc>
       </w:tr>
@@ -4558,43 +4616,45 @@
               <w:rPr>
                 <w:rFonts w:ascii="Calibri" w:hAnsi="Calibri" w:cs="Calibri"/>
               </w:rPr>
-              <w:t>63</w:t>
+              <w:t>64</w:t>
             </w:r>
           </w:p>
         </w:tc>
         <w:tc>
           <w:tcPr>
             <w:tcW w:w="3870" w:type="dxa"/>
-          </w:tcPr>
-          <w:p>
-            <w:pPr>
-              <w:spacing w:after="0" w:line="240" w:lineRule="auto"/>
-              <w:jc w:val="center"/>
-              <w:rPr>
-                <w:rFonts w:ascii="Calibri" w:hAnsi="Calibri" w:cs="Calibri"/>
-              </w:rPr>
-            </w:pPr>
-            <w:r>
-              <w:t>TANGALIN, PROTACIO P. JR.</w:t>
-            </w:r>
+            <w:vAlign w:val="center"/>
+          </w:tcPr>
+          <w:p>
+            <w:pPr>
+              <w:spacing w:after="0" w:line="240" w:lineRule="auto"/>
+              <w:jc w:val="center"/>
+              <w:rPr>
+                <w:rFonts w:ascii="Arial" w:eastAsiaTheme="minorHAnsi" w:hAnsi="Arial" w:cs="Arial"/>
+                <w:sz w:val="24"/>
+                <w:szCs w:val="24"/>
+                <w:lang w:val="en-PH"/>
+              </w:rPr>
+            </w:pPr>
           </w:p>
         </w:tc>
         <w:tc>
           <w:tcPr>
             <w:tcW w:w="4410" w:type="dxa"/>
             <w:shd w:val="clear" w:color="auto" w:fill="FFFFFF" w:themeFill="background1"/>
-          </w:tcPr>
-          <w:p>
-            <w:pPr>
-              <w:spacing w:after="0" w:line="240" w:lineRule="auto"/>
-              <w:jc w:val="center"/>
-              <w:rPr>
-                <w:rFonts w:ascii="Calibri" w:hAnsi="Calibri" w:cs="Calibri"/>
-              </w:rPr>
-            </w:pPr>
-            <w:r>
-              <w:t>SP</w:t>
-            </w:r>
+            <w:vAlign w:val="bottom"/>
+          </w:tcPr>
+          <w:p>
+            <w:pPr>
+              <w:spacing w:after="0" w:line="240" w:lineRule="auto"/>
+              <w:jc w:val="center"/>
+              <w:rPr>
+                <w:rFonts w:ascii="Arial" w:eastAsiaTheme="minorHAnsi" w:hAnsi="Arial" w:cs="Arial"/>
+                <w:sz w:val="24"/>
+                <w:szCs w:val="24"/>
+                <w:lang w:val="en-PH"/>
+              </w:rPr>
+            </w:pPr>
           </w:p>
         </w:tc>
       </w:tr>
@@ -4622,7 +4682,7 @@
               <w:rPr>
                 <w:rFonts w:ascii="Calibri" w:hAnsi="Calibri" w:cs="Calibri"/>
               </w:rPr>
-              <w:t>64</w:t>
+              <w:t>65</w:t>
             </w:r>
           </w:p>
         </w:tc>
@@ -4688,7 +4748,7 @@
               <w:rPr>
                 <w:rFonts w:ascii="Calibri" w:hAnsi="Calibri" w:cs="Calibri"/>
               </w:rPr>
-              <w:t>65</w:t>
+              <w:t>66</w:t>
             </w:r>
           </w:p>
         </w:tc>
@@ -4754,7 +4814,7 @@
               <w:rPr>
                 <w:rFonts w:ascii="Calibri" w:hAnsi="Calibri" w:cs="Calibri"/>
               </w:rPr>
-              <w:t>66</w:t>
+              <w:t>67</w:t>
             </w:r>
           </w:p>
         </w:tc>
@@ -4820,7 +4880,7 @@
               <w:rPr>
                 <w:rFonts w:ascii="Calibri" w:hAnsi="Calibri" w:cs="Calibri"/>
               </w:rPr>
-              <w:t>67</w:t>
+              <w:t>68</w:t>
             </w:r>
           </w:p>
         </w:tc>
@@ -4834,10 +4894,9 @@
               <w:spacing w:after="0" w:line="240" w:lineRule="auto"/>
               <w:jc w:val="center"/>
               <w:rPr>
-                <w:rFonts w:ascii="Arial" w:eastAsiaTheme="minorHAnsi" w:hAnsi="Arial" w:cs="Arial"/>
-                <w:sz w:val="24"/>
-                <w:szCs w:val="24"/>
-                <w:lang w:val="en-PH"/>
+                <w:rFonts w:eastAsia="Times New Roman"/>
+                <w:sz w:val="24"/>
+                <w:szCs w:val="24"/>
               </w:rPr>
             </w:pPr>
           </w:p>
@@ -4886,71 +4945,6 @@
               <w:rPr>
                 <w:rFonts w:ascii="Calibri" w:hAnsi="Calibri" w:cs="Calibri"/>
               </w:rPr>
-              <w:t>68</w:t>
-            </w:r>
-          </w:p>
-        </w:tc>
-        <w:tc>
-          <w:tcPr>
-            <w:tcW w:w="3870" w:type="dxa"/>
-            <w:vAlign w:val="center"/>
-          </w:tcPr>
-          <w:p>
-            <w:pPr>
-              <w:spacing w:after="0" w:line="240" w:lineRule="auto"/>
-              <w:jc w:val="center"/>
-              <w:rPr>
-                <w:rFonts w:eastAsia="Times New Roman"/>
-                <w:sz w:val="24"/>
-                <w:szCs w:val="24"/>
-              </w:rPr>
-            </w:pPr>
-          </w:p>
-        </w:tc>
-        <w:tc>
-          <w:tcPr>
-            <w:tcW w:w="4410" w:type="dxa"/>
-            <w:shd w:val="clear" w:color="auto" w:fill="FFFFFF" w:themeFill="background1"/>
-            <w:vAlign w:val="bottom"/>
-          </w:tcPr>
-          <w:p>
-            <w:pPr>
-              <w:spacing w:after="0" w:line="240" w:lineRule="auto"/>
-              <w:jc w:val="center"/>
-              <w:rPr>
-                <w:rFonts w:ascii="Arial" w:eastAsiaTheme="minorHAnsi" w:hAnsi="Arial" w:cs="Arial"/>
-                <w:sz w:val="24"/>
-                <w:szCs w:val="24"/>
-                <w:lang w:val="en-PH"/>
-              </w:rPr>
-            </w:pPr>
-          </w:p>
-        </w:tc>
-      </w:tr>
-      <w:tr>
-        <w:trPr>
-          <w:trHeight w:val="98"/>
-        </w:trPr>
-        <w:tc>
-          <w:tcPr>
-            <w:tcW w:w="985" w:type="dxa"/>
-            <w:vAlign w:val="center"/>
-          </w:tcPr>
-          <w:p>
-            <w:pPr>
-              <w:spacing w:after="0" w:line="240" w:lineRule="auto"/>
-              <w:jc w:val="center"/>
-              <w:rPr>
-                <w:rFonts w:ascii="Arial" w:eastAsiaTheme="minorHAnsi" w:hAnsi="Arial" w:cs="Arial"/>
-                <w:sz w:val="24"/>
-                <w:szCs w:val="24"/>
-                <w:lang w:val="en-PH"/>
-              </w:rPr>
-            </w:pPr>
-            <w:r>
-              <w:rPr>
-                <w:rFonts w:ascii="Calibri" w:hAnsi="Calibri" w:cs="Calibri"/>
-              </w:rPr>
               <w:t>69</w:t>
             </w:r>
           </w:p>
@@ -5056,9 +5050,6 @@
                 <w:lang w:val="en-PH"/>
               </w:rPr>
             </w:pPr>
-            <w:r>
-              <w:t>Slot for the chef</w:t>
-            </w:r>
           </w:p>
         </w:tc>
       </w:tr>
@@ -5465,7 +5456,29 @@
           <w:szCs w:val="24"/>
           <w:lang w:val="en-PH"/>
         </w:rPr>
-        <w:t xml:space="preserve">October 20, 2026 (TUESDAY) from 8:00 AM to 5:00 PM at CDRRMC Building, </w:t>
+        <w:t>October 20, 2026 (TUESDAY) from 8:00 AM to 5:00 PM at CDRRM</w:t>
+      </w:r>
+      <w:r>
+        <w:rPr>
+          <w:rFonts w:ascii="Arial" w:eastAsia="Calibri" w:hAnsi="Arial" w:cs="Arial"/>
+          <w:b/>
+          <w:bCs/>
+          <w:sz w:val="24"/>
+          <w:szCs w:val="24"/>
+          <w:lang w:val="en-PH"/>
+        </w:rPr>
+        <w:t>O</w:t>
+      </w:r>
+      <w:r>
+        <w:rPr>
+          <w:rFonts w:ascii="Arial" w:eastAsia="Calibri" w:hAnsi="Arial" w:cs="Arial"/>
+          <w:b/>
+          <w:bCs/>
+          <w:sz w:val="24"/>
+          <w:szCs w:val="24"/>
+          <w:lang w:val="en-PH"/>
+        </w:rPr>
+        <w:t xml:space="preserve"> Building, </w:t>
       </w:r>
       <w:proofErr w:type="spellStart"/>
       <w:r>
@@ -6897,6 +6910,7 @@
   <w:style w:type="character" w:default="1" w:styleId="DefaultParagraphFont">
     <w:name w:val="Default Paragraph Font"/>
     <w:uiPriority w:val="1"/>
+    <w:semiHidden/>
     <w:unhideWhenUsed/>
   </w:style>
   <w:style w:type="table" w:default="1" w:styleId="TableNormal">

</xml_diff>